<commit_message>
Aprobacion de piezas en tono directo: 'me pasas los videos, los apruebo y salen' — sin el 'minutos no dias' condescendiente
Co-Authored-By: Claude Fable 5 <noreply@anthropic.com>
Claude-Session: https://claude.ai/code/session_01L7UVFxHQqF8Q2935VhdxJh
</commit_message>
<xml_diff>
--- a/recursos/comercial/INDUCCION_COMERCIAL/CONDICIONES_ECONOMICAS_CERRADORA.docx
+++ b/recursos/comercial/INDUCCION_COMERCIAL/CONDICIONES_ECONOMICAS_CERRADORA.docx
@@ -999,13 +999,13 @@
           <w:b/>
           <w:sz w:val="20"/>
         </w:rPr>
-        <w:t xml:space="preserve">La pieza final la ve gerencia antes de publicarse </w:t>
+        <w:t xml:space="preserve">Antes de publicar: </w:t>
       </w:r>
       <w:r>
         <w:rPr>
           <w:sz w:val="20"/>
         </w:rPr>
-        <w:t>(es un video de 40 segundos: minutos, no días). Más videos tuyos con los briefs = más leads tuyos.</w:t>
+        <w:t>me pasas los videos, los apruebo y salen. Más videos tuyos con los briefs = más leads tuyos.</w:t>
       </w:r>
     </w:p>
     <w:p>

</xml_diff>

<commit_message>
Reglas de plata corregidas: efectivo permitido solo EN LA SEDE con recibo (no prohibido), y regla nueva — la matricula se FORMALIZA en la sede (contrato firmado alli, nada queda cerrado por chat)
Co-Authored-By: Claude Fable 5 <noreply@anthropic.com>
Claude-Session: https://claude.ai/code/session_01L7UVFxHQqF8Q2935VhdxJh
</commit_message>
<xml_diff>
--- a/recursos/comercial/INDUCCION_COMERCIAL/CONDICIONES_ECONOMICAS_CERRADORA.docx
+++ b/recursos/comercial/INDUCCION_COMERCIAL/CONDICIONES_ECONOMICAS_CERRADORA.docx
@@ -1135,7 +1135,33 @@
         <w:rPr>
           <w:sz w:val="20"/>
         </w:rPr>
-        <w:t>nunca a cuentas personales ni en efectivo.</w:t>
+        <w:t>nunca a cuentas personales del vendedor. Efectivo solo EN LA SEDE, en recepción y con recibo.</w:t>
+      </w:r>
+    </w:p>
+    <w:p>
+      <w:pPr>
+        <w:spacing w:after="40"/>
+        <w:ind w:left="227"/>
+      </w:pPr>
+      <w:r>
+        <w:rPr>
+          <w:b/>
+          <w:color w:val="E54C09"/>
+        </w:rPr>
+        <w:t xml:space="preserve">· </w:t>
+      </w:r>
+      <w:r>
+        <w:rPr>
+          <w:b/>
+          <w:sz w:val="20"/>
+        </w:rPr>
+        <w:t xml:space="preserve">La matrícula se FORMALIZA en la sede: </w:t>
+      </w:r>
+      <w:r>
+        <w:rPr>
+          <w:sz w:val="20"/>
+        </w:rPr>
+        <w:t>el contrato de matrícula se firma EN LA SEDE, con el pago o abono registrado allí. Ninguna matrícula queda cerrada por chat.</w:t>
       </w:r>
     </w:p>
     <w:p>

</xml_diff>

<commit_message>
Seccion 10 en neutro: EL PLAN DE ARRANQUE sin 'a tu ritmo pero con plan' ni 'no te persigue'
Co-Authored-By: Claude Fable 5 <noreply@anthropic.com>
Claude-Session: https://claude.ai/code/session_01L7UVFxHQqF8Q2935VhdxJh
</commit_message>
<xml_diff>
--- a/recursos/comercial/INDUCCION_COMERCIAL/CONDICIONES_ECONOMICAS_CERRADORA.docx
+++ b/recursos/comercial/INDUCCION_COMERCIAL/CONDICIONES_ECONOMICAS_CERRADORA.docx
@@ -1252,7 +1252,7 @@
           <w:color w:val="E54C09"/>
           <w:sz w:val="24"/>
         </w:rPr>
-        <w:t>10. EL PLAN DE ARRANQUE (a tu ritmo, pero con plan)</w:t>
+        <w:t>10. EL PLAN DE ARRANQUE</w:t>
       </w:r>
     </w:p>
     <w:p>
@@ -1264,7 +1264,7 @@
           <w:b/>
           <w:sz w:val="20"/>
         </w:rPr>
-        <w:t>Firma → kit completo de venta en el acto → grabas las 5 piezas → subtítulos → tu campaña al aire. Tu puerta del 10% empieza a contar el día que TU primera campaña se publica — el sistema arranca contigo, no te persigue. Lo único con fecha fija es la cohorte: 5 de octubre.</w:t>
+        <w:t>Firma → kit completo de venta en el acto → grabas las 5 piezas → subtítulos → tu campaña al aire. Tu puerta del 10% cuenta desde el día en que tu primera campaña se publica. La única fecha fija es la cohorte: 5 de octubre.</w:t>
       </w:r>
     </w:p>
     <w:p>

</xml_diff>

<commit_message>
Doctrina de matricula en dos momentos aplicada en todo: separacion 100pct digital (abono + aceptacion escrita Ley 527 + cita agendada) y formalizacion en sede — condiciones cerradora, recibo numeral 6, y DUDA 9 nueva; ademas sabatino (comisiona igual, no mueve contador) y venta al cliente con nivel (paquete desde su nivel a B2, tickets mayores)
Co-Authored-By: Claude Fable 5 <noreply@anthropic.com>
Claude-Session: https://claude.ai/code/session_01L7UVFxHQqF8Q2935VhdxJh
</commit_message>
<xml_diff>
--- a/recursos/comercial/INDUCCION_COMERCIAL/CONDICIONES_ECONOMICAS_CERRADORA.docx
+++ b/recursos/comercial/INDUCCION_COMERCIAL/CONDICIONES_ECONOMICAS_CERRADORA.docx
@@ -171,6 +171,58 @@
           <w:sz w:val="20"/>
         </w:rPr>
         <w:t>abono de $300.000 hoy congela cupo y precio; el desembolso o el cheque llegan en máximo 10 días hábiles.</w:t>
+      </w:r>
+    </w:p>
+    <w:p>
+      <w:pPr>
+        <w:spacing w:after="40"/>
+        <w:ind w:left="227"/>
+      </w:pPr>
+      <w:r>
+        <w:rPr>
+          <w:b/>
+          <w:color w:val="E54C09"/>
+        </w:rPr>
+        <w:t xml:space="preserve">· </w:t>
+      </w:r>
+      <w:r>
+        <w:rPr>
+          <w:b/>
+          <w:sz w:val="20"/>
+        </w:rPr>
+        <w:t xml:space="preserve">MODALIDAD SABATINA: </w:t>
+      </w:r>
+      <w:r>
+        <w:rPr>
+          <w:sz w:val="20"/>
+        </w:rPr>
+        <w:t>quien solo puede estudiar los sábados también se matricula, a las tarifas de la matriz vigente. Ningún cliente se va por el horario.</w:t>
+      </w:r>
+    </w:p>
+    <w:p>
+      <w:pPr>
+        <w:spacing w:after="40"/>
+        <w:ind w:left="227"/>
+      </w:pPr>
+      <w:r>
+        <w:rPr>
+          <w:b/>
+          <w:color w:val="E54C09"/>
+        </w:rPr>
+        <w:t xml:space="preserve">· </w:t>
+      </w:r>
+      <w:r>
+        <w:rPr>
+          <w:b/>
+          <w:sz w:val="20"/>
+        </w:rPr>
+        <w:t xml:space="preserve">EL QUE YA TIENE NIVEL: </w:t>
+      </w:r>
+      <w:r>
+        <w:rPr>
+          <w:sz w:val="20"/>
+        </w:rPr>
+        <w:t>la sesión de ubicación define su nivel, y se le vende el paquete DESDE SU NIVEL hasta B2 con beca del Fondo (A2→B2 $7.100.000 full · B1→B2 $5.185.000 full — la tarjeta de becas trae la matriz por perfil), o su nivel individual. Entra al grupo vigente de su nivel o separa cupo para la próxima apertura. Comisiona igual por canal — tickets a menudo mayores que un Arranque. Ningún cliente se va por saber inglés.</w:t>
       </w:r>
     </w:p>
     <w:p>
@@ -732,6 +784,32 @@
     </w:p>
     <w:p>
       <w:pPr>
+        <w:spacing w:after="40"/>
+        <w:ind w:left="227"/>
+      </w:pPr>
+      <w:r>
+        <w:rPr>
+          <w:b/>
+          <w:color w:val="E54C09"/>
+        </w:rPr>
+        <w:t xml:space="preserve">· </w:t>
+      </w:r>
+      <w:r>
+        <w:rPr>
+          <w:b/>
+          <w:sz w:val="20"/>
+        </w:rPr>
+        <w:t xml:space="preserve">Tus porcentajes aplican a TODO el portafolio: </w:t>
+      </w:r>
+      <w:r>
+        <w:rPr>
+          <w:sz w:val="20"/>
+        </w:rPr>
+        <w:t>Arranque, programas completos, niveles individuales y sabatinos. Las PUERTAS del 10% y el bono cuentan solo matrículas de la cohorte del 5 de octubre — el resto comisiona normal sin mover el contador.</w:t>
+      </w:r>
+    </w:p>
+    <w:p>
+      <w:pPr>
         <w:spacing w:before="140" w:after="40"/>
       </w:pPr>
       <w:r>
@@ -1155,13 +1233,13 @@
           <w:b/>
           <w:sz w:val="20"/>
         </w:rPr>
-        <w:t xml:space="preserve">La matrícula se FORMALIZA en la sede: </w:t>
+        <w:t xml:space="preserve">La matrícula tiene DOS momentos: </w:t>
       </w:r>
       <w:r>
         <w:rPr>
           <w:sz w:val="20"/>
         </w:rPr>
-        <w:t>el contrato de matrícula se firma EN LA SEDE, con el pago o abono registrado allí. Ninguna matrícula queda cerrada por chat.</w:t>
+        <w:t>la SEPARACIÓN puede ser 100% digital — abono a cuentas de la academia + aceptación escrita del recibo de separación + cita de ubicación agendada en el mismo acto. La FORMALIZACIÓN es siempre en la sede: contrato de matrícula firmado en físico, a más tardar el día de la sesión de ubicación. El chat asegura el cupo; la sede firma el contrato.</w:t>
       </w:r>
     </w:p>
     <w:p>

</xml_diff>

<commit_message>
Sabatinos desde los 12 años (contrato del menor lo firma acudiente); jornadas de semana siguen 17+; sabatino como mercado de papas
Co-Authored-By: Claude Fable 5 <noreply@anthropic.com>
Claude-Session: https://claude.ai/code/session_01L7UVFxHQqF8Q2935VhdxJh
</commit_message>
<xml_diff>
--- a/recursos/comercial/INDUCCION_COMERCIAL/CONDICIONES_ECONOMICAS_CERRADORA.docx
+++ b/recursos/comercial/INDUCCION_COMERCIAL/CONDICIONES_ECONOMICAS_CERRADORA.docx
@@ -196,7 +196,7 @@
         <w:rPr>
           <w:sz w:val="20"/>
         </w:rPr>
-        <w:t>quien solo puede estudiar los sábados también se matricula, a las tarifas de la matriz vigente. Ningún cliente se va por el horario.</w:t>
+        <w:t>quien solo puede estudiar los sábados también se matricula, a las tarifas de la matriz vigente — y recibe desde los 12 AÑOS (el mercado de papás que las jornadas de semana no atienden). Ningún cliente se va por el horario ni por la edad.</w:t>
       </w:r>
     </w:p>
     <w:p>
@@ -856,7 +856,7 @@
         <w:rPr>
           <w:sz w:val="20"/>
         </w:rPr>
-        <w:t>17 años o más, y sesión de ubicación ANTES de decidir (el nivel lo define la academia, no el cliente).</w:t>
+        <w:t>jornadas de semana desde los 17 años · modalidad SABATINA desde los 12 (el contrato del menor lo firma su acudiente). Siempre: sesión de ubicación ANTES de decidir — el nivel lo define la academia, no el cliente.</w:t>
       </w:r>
     </w:p>
     <w:p>

</xml_diff>